<commit_message>
docs: update project changelog and report document with recent optimizations
</commit_message>
<xml_diff>
--- a/docs/HBD_Dashboard_Automation_Report.docx
+++ b/docs/HBD_Dashboard_Automation_Report.docx
@@ -647,6 +647,83 @@
         <w:t>• Query Optimization: Utilizes database-level group queries to filter duplicates, avoiding RAM lags and enabling instant pagination search on the frontend.</w:t>
       </w:r>
     </w:p>
+    <w:p>
+      <w:pPr>
+        <w:pStyle w:val="Heading2"/>
+        <w:spacing w:before="360" w:after="120"/>
+      </w:pPr>
+      <w:r>
+        <w:t>5. Recent System Optimizations &amp; Ongoing Work</w:t>
+      </w:r>
+    </w:p>
+    <w:p>
+      <w:pPr>
+        <w:spacing w:after="240"/>
+      </w:pPr>
+      <w:r>
+        <w:t>This section summarizes the recent technical improvements, schema standardizations, and current ongoing pipeline operations:</w:t>
+      </w:r>
+    </w:p>
+    <w:p>
+      <w:pPr>
+        <w:pStyle w:val="Heading3"/>
+      </w:pPr>
+      <w:r>
+        <w:t>A. Resilient Database Restoration (restore.py):</w:t>
+      </w:r>
+    </w:p>
+    <w:p>
+      <w:pPr>
+        <w:spacing w:after="240"/>
+      </w:pPr>
+      <w:r>
+        <w:t>• Chunked Safety Merge: Re-engineered the missing records merge-copy logic to run in small chunks of 200,000 rows using ID range conditions, preventing MySQL lost connection timeouts.</w:t>
+        <w:br/>
+        <w:t>• Transaction Safety Guard: Added db.session.rollback() on exceptions to keep the session active and healthy.</w:t>
+        <w:br/>
+        <w:t>• Command Renaming: Renamed the script to restore.py in the repository to make terminal commands short and easy to execute in Coolify.</w:t>
+      </w:r>
+    </w:p>
+    <w:p>
+      <w:pPr>
+        <w:pStyle w:val="Heading3"/>
+      </w:pPr>
+      <w:r>
+        <w:t>B. State Standardization &amp; Alias Normalization:</w:t>
+      </w:r>
+    </w:p>
+    <w:p>
+      <w:pPr>
+        <w:spacing w:after="240"/>
+      </w:pPr>
+      <w:r>
+        <w:t>• Module-Level State Standardization: Standardized the 74 unique spelling variations, casing differences, and state codes present in Location_Master_India down to the 36 official states of India.</w:t>
+        <w:br/>
+        <w:t>• Database Alias Storage: Programmed the location builder to insert only the 36 clean, official states in location_master, while automatically registering all 74 raw variations and codes in location_aliases.</w:t>
+        <w:br/>
+        <w:t>• Parent Caching: Caches raw spelling keys to their standardized state IDs so that subsequent city and area migrations correctly match their parent state node.</w:t>
+      </w:r>
+    </w:p>
+    <w:p>
+      <w:pPr>
+        <w:pStyle w:val="Heading3"/>
+      </w:pPr>
+      <w:r>
+        <w:t>C. Ongoing Pipeline Consolidation:</w:t>
+      </w:r>
+    </w:p>
+    <w:p>
+      <w:pPr>
+        <w:spacing w:after="240"/>
+      </w:pPr>
+      <w:r>
+        <w:t>• Targeted Syncing: Syncs new directories (magicpin, atm, post_office) directly into master_table via custom Python CLI calls to prevent key collisions or duplicates.</w:t>
+        <w:br/>
+        <w:t>• Data Cleaning &amp; Deduplication: Applies standard clean sweeps to filter duplicates and route invalid numbers/addresses to review queues.</w:t>
+        <w:br/>
+        <w:t>• Address Parsing: Extracts Level 5 to Level 7 (localities, streets, buildings) from cleansed address text.</w:t>
+      </w:r>
+    </w:p>
     <w:sectPr>
       <w:pgSz w:w="12240" w:h="15840"/>
       <w:pgMar w:top="1440" w:right="1440" w:bottom="1440" w:left="1440" w:header="720" w:footer="720" w:gutter="0"/>

</xml_diff>